<commit_message>
Update Module 5 document with Github link
</commit_message>
<xml_diff>
--- a/module-5/Cortez-Module-5.2-Movies-Setup.docx
+++ b/module-5/Cortez-Module-5.2-Movies-Setup.docx
@@ -181,6 +181,9 @@
     <w:p/>
     <w:p>
       <w:r>
+        <w:rPr>
+          <w:noProof/>
+        </w:rPr>
         <w:lastRenderedPageBreak/>
         <w:drawing>
           <wp:inline distT="0" distB="0" distL="0" distR="0" wp14:anchorId="19FF6D3D" wp14:editId="0D62D04F">
@@ -222,6 +225,19 @@
     <w:p>
       <w:r>
         <w:t>Figure 3. Python script successfully connected to the MySQL movies database using credentials stored in the .env file.</w:t>
+      </w:r>
+    </w:p>
+    <w:p/>
+    <w:p/>
+    <w:p>
+      <w:r>
+        <w:t>GitHub Repository</w:t>
+      </w:r>
+    </w:p>
+    <w:p/>
+    <w:p>
+      <w:r>
+        <w:t>https://github.com/LUISCORTEZUSA2018/csd-310</w:t>
       </w:r>
     </w:p>
     <w:sectPr>

</xml_diff>